<commit_message>
update CV Aug, ICIBM conference
</commit_message>
<xml_diff>
--- a/CV_Weidong_Wu.docx
+++ b/CV_Weidong_Wu.docx
@@ -2217,144 +2217,270 @@
         <w:ind w:left="1260" w:hanging="1260"/>
         <w:rPr>
           <w:rFonts w:ascii="Arial" w:hAnsi="Arial" w:cs="Arial"/>
-          <w:b/>
-          <w:bCs/>
+          <w:bCs/>
+        </w:rPr>
+      </w:pPr>
+      <w:r>
+        <w:rPr>
+          <w:rFonts w:ascii="Arial" w:hAnsi="Arial" w:cs="Arial"/>
           <w:iCs/>
         </w:rPr>
-      </w:pPr>
+        <w:t>Juile Zhu</w:t>
+      </w:r>
       <w:r>
         <w:rPr>
           <w:rFonts w:ascii="Arial" w:hAnsi="Arial" w:cs="Arial"/>
           <w:iCs/>
         </w:rPr>
-        <w:t>Juile Zhu</w:t>
+        <w:t xml:space="preserve"> </w:t>
       </w:r>
       <w:r>
         <w:rPr>
           <w:rFonts w:ascii="Arial" w:hAnsi="Arial" w:cs="Arial"/>
           <w:iCs/>
         </w:rPr>
+        <w:t>(</w:t>
+      </w:r>
+      <w:r>
+        <w:rPr>
+          <w:rFonts w:ascii="Arial" w:hAnsi="Arial" w:cs="Arial"/>
+          <w:bCs/>
+        </w:rPr>
+        <w:t>B.S.</w:t>
+      </w:r>
+      <w:r>
+        <w:rPr>
+          <w:rFonts w:ascii="Arial" w:hAnsi="Arial" w:cs="Arial"/>
+          <w:bCs/>
+        </w:rPr>
+        <w:t xml:space="preserve">, </w:t>
+      </w:r>
+      <w:r>
+        <w:rPr>
+          <w:rFonts w:ascii="Arial" w:hAnsi="Arial" w:cs="Arial"/>
+          <w:bCs/>
+        </w:rPr>
+        <w:t xml:space="preserve">Applied Mathematics </w:t>
+      </w:r>
+      <w:r>
+        <w:rPr>
+          <w:rFonts w:ascii="Arial" w:hAnsi="Arial" w:cs="Arial"/>
+          <w:bCs/>
+        </w:rPr>
+        <w:t xml:space="preserve">in </w:t>
+      </w:r>
+      <w:r>
+        <w:rPr>
+          <w:rFonts w:ascii="Arial" w:hAnsi="Arial" w:cs="Arial"/>
+          <w:bCs/>
+        </w:rPr>
+        <w:t>Neuroscience</w:t>
+      </w:r>
+      <w:r>
+        <w:rPr>
+          <w:rFonts w:ascii="Arial" w:hAnsi="Arial" w:cs="Arial"/>
+          <w:bCs/>
+        </w:rPr>
         <w:t xml:space="preserve"> </w:t>
       </w:r>
       <w:r>
         <w:rPr>
           <w:rFonts w:ascii="Arial" w:hAnsi="Arial" w:cs="Arial"/>
+          <w:bCs/>
+        </w:rPr>
+        <w:t>Physics Track</w:t>
+      </w:r>
+      <w:r>
+        <w:rPr>
+          <w:rFonts w:ascii="Arial" w:hAnsi="Arial" w:cs="Arial"/>
+          <w:bCs/>
+        </w:rPr>
+        <w:t xml:space="preserve">, </w:t>
+      </w:r>
+      <w:r>
+        <w:rPr>
+          <w:rFonts w:ascii="Arial" w:hAnsi="Arial" w:cs="Arial"/>
+          <w:bCs/>
+        </w:rPr>
+        <w:t>OSU</w:t>
+      </w:r>
+      <w:r>
+        <w:rPr>
+          <w:rFonts w:ascii="Arial" w:hAnsi="Arial" w:cs="Arial"/>
           <w:iCs/>
         </w:rPr>
-        <w:t>(</w:t>
-      </w:r>
-      <w:r>
-        <w:rPr>
-          <w:rFonts w:ascii="Arial" w:hAnsi="Arial" w:cs="Arial"/>
+        <w:t>)</w:t>
+      </w:r>
+      <w:r>
+        <w:rPr>
+          <w:rFonts w:ascii="Arial" w:hAnsi="Arial" w:cs="Arial"/>
+          <w:b/>
+          <w:bCs/>
           <w:iCs/>
         </w:rPr>
-        <w:t>Applied Mathematics Physics Track</w:t>
-      </w:r>
-      <w:r>
-        <w:rPr>
-          <w:rFonts w:ascii="Arial" w:hAnsi="Arial" w:cs="Arial"/>
+        <w:t xml:space="preserve"> </w:t>
+      </w:r>
+      <w:r>
+        <w:rPr>
+          <w:rFonts w:ascii="Arial" w:hAnsi="Arial" w:cs="Arial"/>
+          <w:b/>
+          <w:bCs/>
           <w:iCs/>
         </w:rPr>
-        <w:t xml:space="preserve">, </w:t>
-      </w:r>
-      <w:r>
-        <w:rPr>
-          <w:rFonts w:ascii="Arial" w:hAnsi="Arial" w:cs="Arial"/>
+        <w:tab/>
+      </w:r>
+      <w:r>
+        <w:rPr>
+          <w:rFonts w:ascii="Arial" w:hAnsi="Arial" w:cs="Arial"/>
+          <w:b/>
+          <w:bCs/>
           <w:iCs/>
         </w:rPr>
-        <w:t>OSU</w:t>
-      </w:r>
-      <w:r>
-        <w:rPr>
-          <w:rFonts w:ascii="Arial" w:hAnsi="Arial" w:cs="Arial"/>
+        <w:t xml:space="preserve"> </w:t>
+      </w:r>
+      <w:r>
+        <w:rPr>
+          <w:rFonts w:ascii="Arial" w:hAnsi="Arial" w:cs="Arial"/>
+          <w:b/>
+          <w:bCs/>
           <w:iCs/>
         </w:rPr>
-        <w:t>)</w:t>
-      </w:r>
-      <w:r>
+        <w:tab/>
+      </w:r>
+      <w:r>
+        <w:rPr>
+          <w:rFonts w:ascii="Arial" w:hAnsi="Arial" w:cs="Arial"/>
+          <w:bCs/>
+        </w:rPr>
+        <w:t>202</w:t>
+      </w:r>
+      <w:r>
+        <w:rPr>
+          <w:rFonts w:ascii="Arial" w:hAnsi="Arial" w:cs="Arial"/>
+          <w:bCs/>
+        </w:rPr>
+        <w:t xml:space="preserve">5/08 </w:t>
+      </w:r>
+      <w:r>
+        <w:rPr>
+          <w:rFonts w:ascii="Arial" w:hAnsi="Arial" w:cs="Arial"/>
+          <w:bCs/>
+        </w:rPr>
+        <w:t>–</w:t>
+      </w:r>
+      <w:r>
+        <w:rPr>
+          <w:rFonts w:ascii="Arial" w:hAnsi="Arial" w:cs="Arial"/>
+          <w:bCs/>
+        </w:rPr>
+        <w:t xml:space="preserve"> current</w:t>
+      </w:r>
+    </w:p>
+    <w:p>
+      <w:pPr>
+        <w:spacing w:line="276" w:lineRule="auto"/>
+        <w:ind w:left="1260" w:hanging="1260"/>
         <w:rPr>
           <w:rFonts w:ascii="Arial" w:hAnsi="Arial" w:cs="Arial"/>
           <w:b/>
           <w:bCs/>
           <w:iCs/>
         </w:rPr>
+      </w:pPr>
+      <w:r>
+        <w:rPr>
+          <w:rFonts w:ascii="Arial" w:hAnsi="Arial" w:cs="Arial"/>
+          <w:bCs/>
+        </w:rPr>
+        <w:t>Arya Wang (</w:t>
+      </w:r>
+      <w:r>
+        <w:rPr>
+          <w:rFonts w:ascii="Arial" w:hAnsi="Arial" w:cs="Arial"/>
+          <w:bCs/>
+        </w:rPr>
+        <w:t>B.S.</w:t>
+      </w:r>
+      <w:r>
+        <w:rPr>
+          <w:rFonts w:ascii="Arial" w:hAnsi="Arial" w:cs="Arial"/>
+          <w:bCs/>
+        </w:rPr>
+        <w:t>,</w:t>
+      </w:r>
+      <w:r>
+        <w:rPr>
+          <w:rFonts w:ascii="Arial" w:hAnsi="Arial" w:cs="Arial"/>
+          <w:bCs/>
+        </w:rPr>
+        <w:t xml:space="preserve"> Applied Mathematics</w:t>
+      </w:r>
+      <w:r>
+        <w:rPr>
+          <w:rFonts w:ascii="Arial" w:hAnsi="Arial" w:cs="Arial"/>
+          <w:bCs/>
+        </w:rPr>
         <w:t xml:space="preserve"> </w:t>
       </w:r>
       <w:r>
         <w:rPr>
           <w:rFonts w:ascii="Arial" w:hAnsi="Arial" w:cs="Arial"/>
-          <w:b/>
-          <w:bCs/>
-          <w:iCs/>
+          <w:bCs/>
+        </w:rPr>
+        <w:t xml:space="preserve">in </w:t>
+      </w:r>
+      <w:r>
+        <w:rPr>
+          <w:rFonts w:ascii="Arial" w:hAnsi="Arial" w:cs="Arial"/>
+          <w:bCs/>
+        </w:rPr>
+        <w:t>Physics Track, OSU</w:t>
+      </w:r>
+      <w:r>
+        <w:rPr>
+          <w:rFonts w:ascii="Arial" w:hAnsi="Arial" w:cs="Arial"/>
+          <w:bCs/>
+        </w:rPr>
+        <w:t xml:space="preserve">) </w:t>
+      </w:r>
+      <w:r>
+        <w:rPr>
+          <w:rFonts w:ascii="Arial" w:hAnsi="Arial" w:cs="Arial"/>
+          <w:bCs/>
         </w:rPr>
         <w:tab/>
       </w:r>
       <w:r>
         <w:rPr>
           <w:rFonts w:ascii="Arial" w:hAnsi="Arial" w:cs="Arial"/>
-          <w:b/>
-          <w:bCs/>
-          <w:iCs/>
+          <w:bCs/>
         </w:rPr>
         <w:tab/>
       </w:r>
       <w:r>
         <w:rPr>
           <w:rFonts w:ascii="Arial" w:hAnsi="Arial" w:cs="Arial"/>
-          <w:b/>
-          <w:bCs/>
-          <w:iCs/>
+          <w:bCs/>
         </w:rPr>
         <w:tab/>
       </w:r>
       <w:r>
         <w:rPr>
           <w:rFonts w:ascii="Arial" w:hAnsi="Arial" w:cs="Arial"/>
-          <w:b/>
-          <w:bCs/>
-          <w:iCs/>
+          <w:bCs/>
         </w:rPr>
         <w:tab/>
       </w:r>
       <w:r>
         <w:rPr>
           <w:rFonts w:ascii="Arial" w:hAnsi="Arial" w:cs="Arial"/>
-          <w:b/>
-          <w:bCs/>
-          <w:iCs/>
+          <w:bCs/>
         </w:rPr>
         <w:tab/>
       </w:r>
       <w:r>
         <w:rPr>
           <w:rFonts w:ascii="Arial" w:hAnsi="Arial" w:cs="Arial"/>
-          <w:b/>
-          <w:bCs/>
-          <w:iCs/>
-        </w:rPr>
-        <w:tab/>
-      </w:r>
-      <w:r>
-        <w:rPr>
-          <w:rFonts w:ascii="Arial" w:hAnsi="Arial" w:cs="Arial"/>
-          <w:b/>
-          <w:bCs/>
-          <w:iCs/>
-        </w:rPr>
-        <w:tab/>
-      </w:r>
-      <w:r>
-        <w:rPr>
-          <w:rFonts w:ascii="Arial" w:hAnsi="Arial" w:cs="Arial"/>
-          <w:b/>
-          <w:bCs/>
-          <w:iCs/>
-        </w:rPr>
-        <w:tab/>
-      </w:r>
-      <w:r>
-        <w:rPr>
-          <w:rFonts w:ascii="Arial" w:hAnsi="Arial" w:cs="Arial"/>
           <w:bCs/>
         </w:rPr>
         <w:t>202</w:t>
@@ -2364,7 +2490,21 @@
           <w:rFonts w:ascii="Arial" w:hAnsi="Arial" w:cs="Arial"/>
           <w:bCs/>
         </w:rPr>
-        <w:t>5/08 - current</w:t>
+        <w:t>5/0</w:t>
+      </w:r>
+      <w:r>
+        <w:rPr>
+          <w:rFonts w:ascii="Arial" w:hAnsi="Arial" w:cs="Arial"/>
+          <w:bCs/>
+        </w:rPr>
+        <w:t>9</w:t>
+      </w:r>
+      <w:r>
+        <w:rPr>
+          <w:rFonts w:ascii="Arial" w:hAnsi="Arial" w:cs="Arial"/>
+          <w:bCs/>
+        </w:rPr>
+        <w:t xml:space="preserve"> – current</w:t>
       </w:r>
     </w:p>
     <w:p>
@@ -2399,11 +2539,19 @@
       <w:pPr>
         <w:rPr>
           <w:rFonts w:ascii="Arial" w:hAnsi="Arial" w:cs="Arial"/>
+          <w:bCs/>
+        </w:rPr>
+      </w:pPr>
+      <w:r>
+        <w:rPr>
+          <w:rFonts w:ascii="Arial" w:hAnsi="Arial" w:cs="Arial"/>
           <w:b/>
           <w:bCs/>
           <w:iCs/>
         </w:rPr>
-      </w:pPr>
+        <w:t xml:space="preserve">Konar, </w:t>
+      </w:r>
+      <w:proofErr w:type="spellStart"/>
       <w:r>
         <w:rPr>
           <w:rFonts w:ascii="Arial" w:hAnsi="Arial" w:cs="Arial"/>
@@ -2411,9 +2559,9 @@
           <w:bCs/>
           <w:iCs/>
         </w:rPr>
-        <w:t xml:space="preserve">Konar, </w:t>
-      </w:r>
-      <w:proofErr w:type="spellStart"/>
+        <w:t>Suvam</w:t>
+      </w:r>
+      <w:proofErr w:type="spellEnd"/>
       <w:r>
         <w:rPr>
           <w:rFonts w:ascii="Arial" w:hAnsi="Arial" w:cs="Arial"/>
@@ -2421,24 +2569,35 @@
           <w:bCs/>
           <w:iCs/>
         </w:rPr>
-        <w:t>Suvam</w:t>
-      </w:r>
-      <w:proofErr w:type="spellEnd"/>
-      <w:r>
-        <w:rPr>
-          <w:rFonts w:ascii="Arial" w:hAnsi="Arial" w:cs="Arial"/>
-          <w:b/>
-          <w:bCs/>
+        <w:t xml:space="preserve"> (</w:t>
+      </w:r>
+      <w:r>
+        <w:rPr>
+          <w:rFonts w:ascii="Arial" w:hAnsi="Arial" w:cs="Arial"/>
           <w:iCs/>
         </w:rPr>
-        <w:t xml:space="preserve"> (</w:t>
+        <w:t xml:space="preserve">B.S. in </w:t>
       </w:r>
       <w:r>
         <w:rPr>
           <w:rFonts w:ascii="Arial" w:hAnsi="Arial" w:cs="Arial"/>
           <w:iCs/>
         </w:rPr>
-        <w:t>High school student)</w:t>
+        <w:t>Carnegie Mellon University</w:t>
+      </w:r>
+      <w:r>
+        <w:rPr>
+          <w:rFonts w:ascii="Arial" w:hAnsi="Arial" w:cs="Arial"/>
+          <w:iCs/>
+        </w:rPr>
+        <w:t>, Now</w:t>
+      </w:r>
+      <w:r>
+        <w:rPr>
+          <w:rFonts w:ascii="Arial" w:hAnsi="Arial" w:cs="Arial"/>
+          <w:iCs/>
+        </w:rPr>
+        <w:t>)</w:t>
       </w:r>
       <w:r>
         <w:rPr>
@@ -2501,41 +2660,6 @@
           <w:rFonts w:ascii="Arial" w:hAnsi="Arial" w:cs="Arial"/>
           <w:bCs/>
         </w:rPr>
-        <w:tab/>
-      </w:r>
-      <w:r>
-        <w:rPr>
-          <w:rFonts w:ascii="Arial" w:hAnsi="Arial" w:cs="Arial"/>
-          <w:bCs/>
-        </w:rPr>
-        <w:tab/>
-      </w:r>
-      <w:r>
-        <w:rPr>
-          <w:rFonts w:ascii="Arial" w:hAnsi="Arial" w:cs="Arial"/>
-          <w:bCs/>
-        </w:rPr>
-        <w:tab/>
-      </w:r>
-      <w:r>
-        <w:rPr>
-          <w:rFonts w:ascii="Arial" w:hAnsi="Arial" w:cs="Arial"/>
-          <w:bCs/>
-        </w:rPr>
-        <w:tab/>
-      </w:r>
-      <w:r>
-        <w:rPr>
-          <w:rFonts w:ascii="Arial" w:hAnsi="Arial" w:cs="Arial"/>
-          <w:bCs/>
-        </w:rPr>
-        <w:tab/>
-      </w:r>
-      <w:r>
-        <w:rPr>
-          <w:rFonts w:ascii="Arial" w:hAnsi="Arial" w:cs="Arial"/>
-          <w:bCs/>
-        </w:rPr>
         <w:t>202</w:t>
       </w:r>
       <w:r>
@@ -2543,13 +2667,33 @@
           <w:rFonts w:ascii="Arial" w:hAnsi="Arial" w:cs="Arial"/>
           <w:bCs/>
         </w:rPr>
-        <w:t>6/06 - current</w:t>
+        <w:t xml:space="preserve">6/06 - </w:t>
+      </w:r>
+      <w:r>
+        <w:rPr>
+          <w:rFonts w:ascii="Arial" w:hAnsi="Arial" w:cs="Arial"/>
+          <w:bCs/>
+        </w:rPr>
+        <w:t>202</w:t>
+      </w:r>
+      <w:r>
+        <w:rPr>
+          <w:rFonts w:ascii="Arial" w:hAnsi="Arial" w:cs="Arial"/>
+          <w:bCs/>
+        </w:rPr>
+        <w:t>6/0</w:t>
+      </w:r>
+      <w:r>
+        <w:rPr>
+          <w:rFonts w:ascii="Arial" w:hAnsi="Arial" w:cs="Arial"/>
+          <w:bCs/>
+        </w:rPr>
+        <w:t>8</w:t>
       </w:r>
     </w:p>
     <w:p>
       <w:pPr>
         <w:spacing w:line="276" w:lineRule="auto"/>
-        <w:ind w:left="1260" w:hanging="1260"/>
         <w:rPr>
           <w:rFonts w:ascii="Arial" w:hAnsi="Arial" w:cs="Arial"/>
           <w:b/>
@@ -4048,6 +4192,120 @@
     </w:lvl>
   </w:abstractNum>
   <w:abstractNum w:abstractNumId="7" w15:restartNumberingAfterBreak="0">
+    <w:nsid w:val="491F70E5"/>
+    <w:multiLevelType w:val="hybridMultilevel"/>
+    <w:tmpl w:val="BEC888E2"/>
+    <w:lvl w:ilvl="0" w:tplc="4B708884">
+      <w:start w:val="6"/>
+      <w:numFmt w:val="bullet"/>
+      <w:lvlText w:val="-"/>
+      <w:lvlJc w:val="left"/>
+      <w:pPr>
+        <w:ind w:left="720" w:hanging="360"/>
+      </w:pPr>
+      <w:rPr>
+        <w:rFonts w:ascii="Arial" w:eastAsia="Times New Roman" w:hAnsi="Arial" w:cs="Arial" w:hint="default"/>
+        <w:b w:val="0"/>
+      </w:rPr>
+    </w:lvl>
+    <w:lvl w:ilvl="1" w:tplc="04090003" w:tentative="1">
+      <w:start w:val="1"/>
+      <w:numFmt w:val="bullet"/>
+      <w:lvlText w:val="o"/>
+      <w:lvlJc w:val="left"/>
+      <w:pPr>
+        <w:ind w:left="1440" w:hanging="360"/>
+      </w:pPr>
+      <w:rPr>
+        <w:rFonts w:ascii="Courier New" w:hAnsi="Courier New" w:cs="Courier New" w:hint="default"/>
+      </w:rPr>
+    </w:lvl>
+    <w:lvl w:ilvl="2" w:tplc="04090005" w:tentative="1">
+      <w:start w:val="1"/>
+      <w:numFmt w:val="bullet"/>
+      <w:lvlText w:val=""/>
+      <w:lvlJc w:val="left"/>
+      <w:pPr>
+        <w:ind w:left="2160" w:hanging="360"/>
+      </w:pPr>
+      <w:rPr>
+        <w:rFonts w:ascii="Wingdings" w:hAnsi="Wingdings" w:hint="default"/>
+      </w:rPr>
+    </w:lvl>
+    <w:lvl w:ilvl="3" w:tplc="04090001" w:tentative="1">
+      <w:start w:val="1"/>
+      <w:numFmt w:val="bullet"/>
+      <w:lvlText w:val=""/>
+      <w:lvlJc w:val="left"/>
+      <w:pPr>
+        <w:ind w:left="2880" w:hanging="360"/>
+      </w:pPr>
+      <w:rPr>
+        <w:rFonts w:ascii="Symbol" w:hAnsi="Symbol" w:hint="default"/>
+      </w:rPr>
+    </w:lvl>
+    <w:lvl w:ilvl="4" w:tplc="04090003" w:tentative="1">
+      <w:start w:val="1"/>
+      <w:numFmt w:val="bullet"/>
+      <w:lvlText w:val="o"/>
+      <w:lvlJc w:val="left"/>
+      <w:pPr>
+        <w:ind w:left="3600" w:hanging="360"/>
+      </w:pPr>
+      <w:rPr>
+        <w:rFonts w:ascii="Courier New" w:hAnsi="Courier New" w:cs="Courier New" w:hint="default"/>
+      </w:rPr>
+    </w:lvl>
+    <w:lvl w:ilvl="5" w:tplc="04090005" w:tentative="1">
+      <w:start w:val="1"/>
+      <w:numFmt w:val="bullet"/>
+      <w:lvlText w:val=""/>
+      <w:lvlJc w:val="left"/>
+      <w:pPr>
+        <w:ind w:left="4320" w:hanging="360"/>
+      </w:pPr>
+      <w:rPr>
+        <w:rFonts w:ascii="Wingdings" w:hAnsi="Wingdings" w:hint="default"/>
+      </w:rPr>
+    </w:lvl>
+    <w:lvl w:ilvl="6" w:tplc="04090001" w:tentative="1">
+      <w:start w:val="1"/>
+      <w:numFmt w:val="bullet"/>
+      <w:lvlText w:val=""/>
+      <w:lvlJc w:val="left"/>
+      <w:pPr>
+        <w:ind w:left="5040" w:hanging="360"/>
+      </w:pPr>
+      <w:rPr>
+        <w:rFonts w:ascii="Symbol" w:hAnsi="Symbol" w:hint="default"/>
+      </w:rPr>
+    </w:lvl>
+    <w:lvl w:ilvl="7" w:tplc="04090003" w:tentative="1">
+      <w:start w:val="1"/>
+      <w:numFmt w:val="bullet"/>
+      <w:lvlText w:val="o"/>
+      <w:lvlJc w:val="left"/>
+      <w:pPr>
+        <w:ind w:left="5760" w:hanging="360"/>
+      </w:pPr>
+      <w:rPr>
+        <w:rFonts w:ascii="Courier New" w:hAnsi="Courier New" w:cs="Courier New" w:hint="default"/>
+      </w:rPr>
+    </w:lvl>
+    <w:lvl w:ilvl="8" w:tplc="04090005" w:tentative="1">
+      <w:start w:val="1"/>
+      <w:numFmt w:val="bullet"/>
+      <w:lvlText w:val=""/>
+      <w:lvlJc w:val="left"/>
+      <w:pPr>
+        <w:ind w:left="6480" w:hanging="360"/>
+      </w:pPr>
+      <w:rPr>
+        <w:rFonts w:ascii="Wingdings" w:hAnsi="Wingdings" w:hint="default"/>
+      </w:rPr>
+    </w:lvl>
+  </w:abstractNum>
+  <w:abstractNum w:abstractNumId="8" w15:restartNumberingAfterBreak="0">
     <w:nsid w:val="4A3D3DE8"/>
     <w:multiLevelType w:val="hybridMultilevel"/>
     <w:tmpl w:val="0EE4BAB2"/>
@@ -4133,7 +4391,7 @@
       </w:pPr>
     </w:lvl>
   </w:abstractNum>
-  <w:abstractNum w:abstractNumId="8" w15:restartNumberingAfterBreak="0">
+  <w:abstractNum w:abstractNumId="9" w15:restartNumberingAfterBreak="0">
     <w:nsid w:val="60A02014"/>
     <w:multiLevelType w:val="hybridMultilevel"/>
     <w:tmpl w:val="C624FFE8"/>
@@ -4246,7 +4504,7 @@
       </w:rPr>
     </w:lvl>
   </w:abstractNum>
-  <w:abstractNum w:abstractNumId="9" w15:restartNumberingAfterBreak="0">
+  <w:abstractNum w:abstractNumId="10" w15:restartNumberingAfterBreak="0">
     <w:nsid w:val="6A9F1F77"/>
     <w:multiLevelType w:val="hybridMultilevel"/>
     <w:tmpl w:val="9B2A2616"/>
@@ -4359,7 +4617,7 @@
       </w:rPr>
     </w:lvl>
   </w:abstractNum>
-  <w:abstractNum w:abstractNumId="10" w15:restartNumberingAfterBreak="0">
+  <w:abstractNum w:abstractNumId="11" w15:restartNumberingAfterBreak="0">
     <w:nsid w:val="7D0C02CA"/>
     <w:multiLevelType w:val="multilevel"/>
     <w:tmpl w:val="531CD40A"/>
@@ -4473,7 +4731,7 @@
     </w:lvl>
   </w:abstractNum>
   <w:num w:numId="1" w16cid:durableId="1643149168">
-    <w:abstractNumId w:val="10"/>
+    <w:abstractNumId w:val="11"/>
   </w:num>
   <w:num w:numId="2" w16cid:durableId="969630502">
     <w:abstractNumId w:val="1"/>
@@ -4482,7 +4740,7 @@
     <w:abstractNumId w:val="5"/>
   </w:num>
   <w:num w:numId="4" w16cid:durableId="1038623199">
-    <w:abstractNumId w:val="7"/>
+    <w:abstractNumId w:val="8"/>
   </w:num>
   <w:num w:numId="5" w16cid:durableId="1979992419">
     <w:abstractNumId w:val="4"/>
@@ -4494,7 +4752,7 @@
     <w:abstractNumId w:val="2"/>
   </w:num>
   <w:num w:numId="8" w16cid:durableId="123013516">
-    <w:abstractNumId w:val="9"/>
+    <w:abstractNumId w:val="10"/>
   </w:num>
   <w:num w:numId="9" w16cid:durableId="429202646">
     <w:abstractNumId w:val="6"/>
@@ -4503,7 +4761,10 @@
     <w:abstractNumId w:val="0"/>
   </w:num>
   <w:num w:numId="11" w16cid:durableId="1907182822">
-    <w:abstractNumId w:val="8"/>
+    <w:abstractNumId w:val="9"/>
+  </w:num>
+  <w:num w:numId="12" w16cid:durableId="2059015489">
+    <w:abstractNumId w:val="7"/>
   </w:num>
   <w:numIdMacAtCleanup w:val="3"/>
 </w:numbering>
@@ -5805,6 +6066,7 @@
     <w:rsid w:val="00565F5E"/>
     <w:rsid w:val="0056798D"/>
     <w:rsid w:val="00576FCD"/>
+    <w:rsid w:val="00583EE8"/>
     <w:rsid w:val="005A2146"/>
     <w:rsid w:val="005A67DB"/>
     <w:rsid w:val="005B0315"/>
@@ -5932,6 +6194,7 @@
     <w:rsid w:val="00E43AA2"/>
     <w:rsid w:val="00E4405C"/>
     <w:rsid w:val="00E67C10"/>
+    <w:rsid w:val="00E72F05"/>
     <w:rsid w:val="00E77AA9"/>
     <w:rsid w:val="00E85A1E"/>
     <w:rsid w:val="00E92B59"/>

</xml_diff>